<commit_message>
new post - commencement
</commit_message>
<xml_diff>
--- a/_site/assets/CV_minakwon.docx
+++ b/_site/assets/CV_minakwon.docx
@@ -1,6 +1,6 @@
 
 <file path=word/document.xml><?xml version="1.0" encoding="utf-8"?>
-<w:document xmlns:wpc="http://schemas.microsoft.com/office/word/2010/wordprocessingCanvas" xmlns:cx="http://schemas.microsoft.com/office/drawing/2014/chartex" xmlns:cx1="http://schemas.microsoft.com/office/drawing/2015/9/8/chartex" xmlns:cx2="http://schemas.microsoft.com/office/drawing/2015/10/21/chartex" xmlns:cx3="http://schemas.microsoft.com/office/drawing/2016/5/9/chartex" xmlns:cx4="http://schemas.microsoft.com/office/drawing/2016/5/10/chartex" xmlns:cx5="http://schemas.microsoft.com/office/drawing/2016/5/11/chartex" xmlns:cx6="http://schemas.microsoft.com/office/drawing/2016/5/12/chartex" xmlns:cx7="http://schemas.microsoft.com/office/drawing/2016/5/13/chartex" xmlns:cx8="http://schemas.microsoft.com/office/drawing/2016/5/14/chartex" xmlns:mc="http://schemas.openxmlformats.org/markup-compatibility/2006" xmlns:aink="http://schemas.microsoft.com/office/drawing/2016/ink" xmlns:am3d="http://schemas.microsoft.com/office/drawing/2017/model3d" xmlns:o="urn:schemas-microsoft-com:office:office" xmlns:r="http://schemas.openxmlformats.org/officeDocument/2006/relationships" xmlns:m="http://schemas.openxmlformats.org/officeDocument/2006/math" xmlns:v="urn:schemas-microsoft-com:vml" xmlns:wp14="http://schemas.microsoft.com/office/word/2010/wordprocessingDrawing" xmlns:wp="http://schemas.openxmlformats.org/drawingml/2006/wordprocessingDrawing" xmlns:w10="urn:schemas-microsoft-com:office:word" xmlns:w="http://schemas.openxmlformats.org/wordprocessingml/2006/main" xmlns:w14="http://schemas.microsoft.com/office/word/2010/wordml" xmlns:w15="http://schemas.microsoft.com/office/word/2012/wordml" xmlns:w16cex="http://schemas.microsoft.com/office/word/2018/wordml/cex" xmlns:w16cid="http://schemas.microsoft.com/office/word/2016/wordml/cid" xmlns:w16="http://schemas.microsoft.com/office/word/2018/wordml" xmlns:w16se="http://schemas.microsoft.com/office/word/2015/wordml/symex" xmlns:wpg="http://schemas.microsoft.com/office/word/2010/wordprocessingGroup" xmlns:wpi="http://schemas.microsoft.com/office/word/2010/wordprocessingInk" xmlns:wne="http://schemas.microsoft.com/office/word/2006/wordml" xmlns:wps="http://schemas.microsoft.com/office/word/2010/wordprocessingShape" mc:Ignorable="w14 w15 w16se w16cid w16 w16cex wp14">
+<w:document xmlns:wpc="http://schemas.microsoft.com/office/word/2010/wordprocessingCanvas" xmlns:cx="http://schemas.microsoft.com/office/drawing/2014/chartex" xmlns:cx1="http://schemas.microsoft.com/office/drawing/2015/9/8/chartex" xmlns:cx2="http://schemas.microsoft.com/office/drawing/2015/10/21/chartex" xmlns:cx3="http://schemas.microsoft.com/office/drawing/2016/5/9/chartex" xmlns:cx4="http://schemas.microsoft.com/office/drawing/2016/5/10/chartex" xmlns:cx5="http://schemas.microsoft.com/office/drawing/2016/5/11/chartex" xmlns:cx6="http://schemas.microsoft.com/office/drawing/2016/5/12/chartex" xmlns:cx7="http://schemas.microsoft.com/office/drawing/2016/5/13/chartex" xmlns:cx8="http://schemas.microsoft.com/office/drawing/2016/5/14/chartex" xmlns:mc="http://schemas.openxmlformats.org/markup-compatibility/2006" xmlns:aink="http://schemas.microsoft.com/office/drawing/2016/ink" xmlns:am3d="http://schemas.microsoft.com/office/drawing/2017/model3d" xmlns:o="urn:schemas-microsoft-com:office:office" xmlns:r="http://schemas.openxmlformats.org/officeDocument/2006/relationships" xmlns:m="http://schemas.openxmlformats.org/officeDocument/2006/math" xmlns:v="urn:schemas-microsoft-com:vml" xmlns:wp14="http://schemas.microsoft.com/office/word/2010/wordprocessingDrawing" xmlns:wp="http://schemas.openxmlformats.org/drawingml/2006/wordprocessingDrawing" xmlns:w10="urn:schemas-microsoft-com:office:word" xmlns:w="http://schemas.openxmlformats.org/wordprocessingml/2006/main" xmlns:w14="http://schemas.microsoft.com/office/word/2010/wordml" xmlns:w15="http://schemas.microsoft.com/office/word/2012/wordml" xmlns:w16cex="http://schemas.microsoft.com/office/word/2018/wordml/cex" xmlns:w16cid="http://schemas.microsoft.com/office/word/2016/wordml/cid" xmlns:w16="http://schemas.microsoft.com/office/word/2018/wordml" xmlns:w16sdtdh="http://schemas.microsoft.com/office/word/2020/wordml/sdtdatahash" xmlns:w16se="http://schemas.microsoft.com/office/word/2015/wordml/symex" xmlns:wpg="http://schemas.microsoft.com/office/word/2010/wordprocessingGroup" xmlns:wpi="http://schemas.microsoft.com/office/word/2010/wordprocessingInk" xmlns:wne="http://schemas.microsoft.com/office/word/2006/wordml" xmlns:wps="http://schemas.microsoft.com/office/word/2010/wordprocessingShape" mc:Ignorable="w14 w15 w16se w16cid w16 w16cex w16sdtdh wp14">
   <w:body>
     <w:p>
       <w:pPr>
@@ -797,15 +797,6 @@
     </w:p>
     <w:p>
       <w:pPr>
-        <w:rPr>
-          <w:rFonts w:ascii="Roboto Light" w:hAnsi="Roboto Light" w:cstheme="minorHAnsi"/>
-          <w:sz w:val="21"/>
-          <w:szCs w:val="21"/>
-        </w:rPr>
-      </w:pPr>
-    </w:p>
-    <w:p>
-      <w:pPr>
         <w:pStyle w:val="Heading1"/>
         <w:rPr>
           <w:rFonts w:ascii="Lato Black" w:hAnsi="Lato Black" w:cstheme="minorHAnsi"/>
@@ -814,14 +805,25 @@
           <w:lang w:eastAsia="ko-KR"/>
         </w:rPr>
       </w:pPr>
-      <w:r>
+    </w:p>
+    <w:p>
+      <w:pPr>
+        <w:pStyle w:val="Heading1"/>
         <w:rPr>
           <w:rFonts w:ascii="Lato Black" w:hAnsi="Lato Black" w:cstheme="minorHAnsi"/>
           <w:sz w:val="22"/>
           <w:szCs w:val="28"/>
           <w:lang w:eastAsia="ko-KR"/>
         </w:rPr>
-        <w:t xml:space="preserve">Poster Presentation </w:t>
+      </w:pPr>
+      <w:r>
+        <w:rPr>
+          <w:rFonts w:ascii="Lato Black" w:hAnsi="Lato Black" w:cstheme="minorHAnsi"/>
+          <w:sz w:val="22"/>
+          <w:szCs w:val="28"/>
+          <w:lang w:eastAsia="ko-KR"/>
+        </w:rPr>
+        <w:t>Publications</w:t>
       </w:r>
     </w:p>
     <w:p>
@@ -853,15 +855,6 @@
       <w:r>
         <w:rPr>
           <w:rFonts w:ascii="Calibri Light" w:hAnsi="Calibri Light" w:cs="Calibri Light"/>
-          <w:sz w:val="20"/>
-          <w:szCs w:val="21"/>
-          <w:lang w:eastAsia="ko-KR"/>
-        </w:rPr>
-        <w:t xml:space="preserve">Park, H., Choi, H., </w:t>
-      </w:r>
-      <w:r>
-        <w:rPr>
-          <w:rFonts w:ascii="Calibri Light" w:hAnsi="Calibri Light" w:cs="Calibri Light"/>
           <w:b/>
           <w:bCs/>
           <w:sz w:val="20"/>
@@ -877,7 +870,7 @@
           <w:szCs w:val="21"/>
           <w:lang w:eastAsia="ko-KR"/>
         </w:rPr>
-        <w:t xml:space="preserve">, </w:t>
+        <w:t xml:space="preserve">, Kim, H., Yang, J., </w:t>
       </w:r>
       <w:proofErr w:type="spellStart"/>
       <w:r>
@@ -887,6 +880,26 @@
           <w:szCs w:val="21"/>
           <w:lang w:eastAsia="ko-KR"/>
         </w:rPr>
+        <w:t>Hur</w:t>
+      </w:r>
+      <w:proofErr w:type="spellEnd"/>
+      <w:r>
+        <w:rPr>
+          <w:rFonts w:ascii="Calibri Light" w:hAnsi="Calibri Light" w:cs="Calibri Light"/>
+          <w:sz w:val="20"/>
+          <w:szCs w:val="21"/>
+          <w:lang w:eastAsia="ko-KR"/>
+        </w:rPr>
+        <w:t xml:space="preserve">, J., Lee, T., &amp; </w:t>
+      </w:r>
+      <w:proofErr w:type="spellStart"/>
+      <w:r>
+        <w:rPr>
+          <w:rFonts w:ascii="Calibri Light" w:hAnsi="Calibri Light" w:cs="Calibri Light"/>
+          <w:sz w:val="20"/>
+          <w:szCs w:val="21"/>
+          <w:lang w:eastAsia="ko-KR"/>
+        </w:rPr>
         <w:t>Ahn</w:t>
       </w:r>
       <w:proofErr w:type="spellEnd"/>
@@ -897,50 +910,109 @@
           <w:szCs w:val="21"/>
           <w:lang w:eastAsia="ko-KR"/>
         </w:rPr>
-        <w:t xml:space="preserve">, W., &amp; Jung, Y. (2020) Neural Correlates of Goal-Directed Control in Interest Gaming Disorder and Alcohol Use Disorder, </w:t>
-      </w:r>
-      <w:r>
-        <w:rPr>
-          <w:rFonts w:ascii="Calibri Light" w:hAnsi="Calibri Light" w:cs="Calibri Light"/>
-          <w:i/>
-          <w:iCs/>
-          <w:sz w:val="20"/>
-          <w:szCs w:val="21"/>
-          <w:lang w:eastAsia="ko-KR"/>
-        </w:rPr>
-        <w:t>E-Poster registration at the Annual Meeting of the Society of Biological Psychiatry</w:t>
-      </w:r>
-      <w:r>
-        <w:rPr>
-          <w:rFonts w:ascii="Calibri Light" w:hAnsi="Calibri Light" w:cs="Calibri Light"/>
-          <w:i/>
-          <w:iCs/>
-          <w:sz w:val="20"/>
-          <w:szCs w:val="21"/>
-          <w:lang w:eastAsia="ko-KR"/>
-        </w:rPr>
-        <w:t>, New York</w:t>
-      </w:r>
-      <w:r>
-        <w:rPr>
-          <w:rFonts w:ascii="Calibri Light" w:hAnsi="Calibri Light" w:cs="Calibri Light"/>
-          <w:i/>
-          <w:iCs/>
+        <w:t>, W. (</w:t>
+      </w:r>
+      <w:r>
+        <w:rPr>
+          <w:rFonts w:ascii="Calibri Light" w:hAnsi="Calibri Light" w:cs="Calibri Light"/>
+          <w:sz w:val="20"/>
+          <w:szCs w:val="21"/>
+          <w:lang w:eastAsia="ko-KR"/>
+        </w:rPr>
+        <w:t>under review).</w:t>
+      </w:r>
+      <w:r>
+        <w:rPr>
+          <w:rFonts w:ascii="Calibri Light" w:hAnsi="Calibri Light" w:cs="Calibri Light"/>
+          <w:sz w:val="20"/>
+          <w:szCs w:val="21"/>
+          <w:lang w:eastAsia="ko-KR"/>
+        </w:rPr>
+        <w:t xml:space="preserve"> </w:t>
+      </w:r>
+      <w:r>
+        <w:rPr>
+          <w:rFonts w:ascii="Calibri Light" w:hAnsi="Calibri Light" w:cs="Calibri Light"/>
+          <w:sz w:val="20"/>
+          <w:szCs w:val="21"/>
+          <w:lang w:eastAsia="ko-KR"/>
+        </w:rPr>
+        <w:t xml:space="preserve">Daily caffeinated soda intake is associated with impaired working memory and higher impulsivity in children. </w:t>
+      </w:r>
+      <w:r>
+        <w:rPr>
+          <w:rFonts w:ascii="Calibri Light" w:hAnsi="Calibri Light" w:cs="Calibri Light"/>
+          <w:i/>
+          <w:iCs/>
+          <w:sz w:val="20"/>
+          <w:szCs w:val="21"/>
+          <w:lang w:eastAsia="ko-KR"/>
+        </w:rPr>
+        <w:t>p</w:t>
+      </w:r>
+      <w:r>
+        <w:rPr>
+          <w:rFonts w:ascii="Calibri Light" w:hAnsi="Calibri Light" w:cs="Calibri Light"/>
+          <w:i/>
+          <w:iCs/>
+          <w:sz w:val="20"/>
+          <w:szCs w:val="21"/>
+          <w:lang w:eastAsia="ko-KR"/>
+        </w:rPr>
+        <w:t>reprint</w:t>
+      </w:r>
+      <w:r>
+        <w:rPr>
+          <w:rFonts w:ascii="Calibri Light" w:hAnsi="Calibri Light" w:cs="Calibri Light"/>
           <w:sz w:val="20"/>
           <w:szCs w:val="21"/>
           <w:lang w:eastAsia="ko-KR"/>
         </w:rPr>
         <w:t>.</w:t>
       </w:r>
-      <w:r>
-        <w:rPr>
-          <w:rFonts w:ascii="Calibri Light" w:hAnsi="Calibri Light" w:cs="Calibri Light"/>
-          <w:sz w:val="20"/>
-          <w:szCs w:val="21"/>
-          <w:lang w:eastAsia="ko-KR"/>
-        </w:rPr>
-        <w:t xml:space="preserve"> </w:t>
-      </w:r>
+    </w:p>
+    <w:p>
+      <w:pPr>
+        <w:pStyle w:val="Heading1"/>
+        <w:rPr>
+          <w:rFonts w:ascii="Lato Black" w:hAnsi="Lato Black" w:cstheme="minorHAnsi"/>
+          <w:sz w:val="22"/>
+          <w:szCs w:val="28"/>
+          <w:lang w:eastAsia="ko-KR"/>
+        </w:rPr>
+      </w:pPr>
+    </w:p>
+    <w:p>
+      <w:pPr>
+        <w:pStyle w:val="Heading1"/>
+        <w:rPr>
+          <w:rFonts w:ascii="Lato Black" w:hAnsi="Lato Black" w:cstheme="minorHAnsi"/>
+          <w:sz w:val="22"/>
+          <w:szCs w:val="28"/>
+          <w:lang w:eastAsia="ko-KR"/>
+        </w:rPr>
+      </w:pPr>
+      <w:r>
+        <w:rPr>
+          <w:rFonts w:ascii="Lato Black" w:hAnsi="Lato Black" w:cstheme="minorHAnsi"/>
+          <w:sz w:val="22"/>
+          <w:szCs w:val="28"/>
+          <w:lang w:eastAsia="ko-KR"/>
+        </w:rPr>
+        <w:t xml:space="preserve">Poster Presentation </w:t>
+      </w:r>
+    </w:p>
+    <w:p>
+      <w:pPr>
+        <w:tabs>
+          <w:tab w:val="right" w:pos="8640"/>
+        </w:tabs>
+        <w:rPr>
+          <w:rFonts w:ascii="Lato" w:hAnsi="Lato" w:cstheme="minorHAnsi"/>
+          <w:sz w:val="16"/>
+          <w:szCs w:val="16"/>
+        </w:rPr>
+      </w:pPr>
     </w:p>
     <w:p>
       <w:pPr>
@@ -951,6 +1023,8 @@
         <w:ind w:left="567" w:hanging="567"/>
         <w:rPr>
           <w:rFonts w:ascii="Calibri Light" w:hAnsi="Calibri Light" w:cs="Calibri Light"/>
+          <w:i/>
+          <w:iCs/>
           <w:sz w:val="20"/>
           <w:szCs w:val="21"/>
           <w:lang w:eastAsia="ko-KR"/>
@@ -974,7 +1048,61 @@
           <w:szCs w:val="21"/>
           <w:lang w:eastAsia="ko-KR"/>
         </w:rPr>
-        <w:t xml:space="preserve">, Kim, H., Yang, J., </w:t>
+        <w:t xml:space="preserve">, </w:t>
+      </w:r>
+      <w:r>
+        <w:rPr>
+          <w:rFonts w:ascii="Calibri Light" w:hAnsi="Calibri Light" w:cs="Calibri Light"/>
+          <w:sz w:val="20"/>
+          <w:szCs w:val="21"/>
+          <w:lang w:eastAsia="ko-KR"/>
+        </w:rPr>
+        <w:t>Lee</w:t>
+      </w:r>
+      <w:r>
+        <w:rPr>
+          <w:rFonts w:ascii="Calibri Light" w:hAnsi="Calibri Light" w:cs="Calibri Light"/>
+          <w:sz w:val="20"/>
+          <w:szCs w:val="21"/>
+          <w:lang w:eastAsia="ko-KR"/>
+        </w:rPr>
+        <w:t xml:space="preserve">, </w:t>
+      </w:r>
+      <w:r>
+        <w:rPr>
+          <w:rFonts w:ascii="Calibri Light" w:hAnsi="Calibri Light" w:cs="Calibri Light"/>
+          <w:sz w:val="20"/>
+          <w:szCs w:val="21"/>
+          <w:lang w:eastAsia="ko-KR"/>
+        </w:rPr>
+        <w:t>J</w:t>
+      </w:r>
+      <w:r>
+        <w:rPr>
+          <w:rFonts w:ascii="Calibri Light" w:hAnsi="Calibri Light" w:cs="Calibri Light"/>
+          <w:sz w:val="20"/>
+          <w:szCs w:val="21"/>
+          <w:lang w:eastAsia="ko-KR"/>
+        </w:rPr>
+        <w:t>.,</w:t>
+      </w:r>
+      <w:r>
+        <w:rPr>
+          <w:rFonts w:ascii="Calibri Light" w:hAnsi="Calibri Light" w:cs="Calibri Light"/>
+          <w:sz w:val="20"/>
+          <w:szCs w:val="21"/>
+          <w:lang w:eastAsia="ko-KR"/>
+        </w:rPr>
+        <w:t xml:space="preserve"> Yang, J., Chang, S., </w:t>
+      </w:r>
+      <w:r>
+        <w:rPr>
+          <w:rFonts w:ascii="Calibri Light" w:hAnsi="Calibri Light" w:cs="Calibri Light"/>
+          <w:sz w:val="20"/>
+          <w:szCs w:val="21"/>
+          <w:lang w:eastAsia="ko-KR"/>
+        </w:rPr>
+        <w:t xml:space="preserve">&amp; </w:t>
       </w:r>
       <w:proofErr w:type="spellStart"/>
       <w:r>
@@ -984,7 +1112,7 @@
           <w:szCs w:val="21"/>
           <w:lang w:eastAsia="ko-KR"/>
         </w:rPr>
-        <w:t>Hur</w:t>
+        <w:t>Ahn</w:t>
       </w:r>
       <w:proofErr w:type="spellEnd"/>
       <w:r>
@@ -994,83 +1122,25 @@
           <w:szCs w:val="21"/>
           <w:lang w:eastAsia="ko-KR"/>
         </w:rPr>
-        <w:t xml:space="preserve">, J., Lee, T., &amp; </w:t>
-      </w:r>
-      <w:proofErr w:type="spellStart"/>
-      <w:r>
-        <w:rPr>
-          <w:rFonts w:ascii="Calibri Light" w:hAnsi="Calibri Light" w:cs="Calibri Light"/>
-          <w:sz w:val="20"/>
-          <w:szCs w:val="21"/>
-          <w:lang w:eastAsia="ko-KR"/>
-        </w:rPr>
-        <w:t>Ahn</w:t>
-      </w:r>
-      <w:proofErr w:type="spellEnd"/>
-      <w:r>
-        <w:rPr>
-          <w:rFonts w:ascii="Calibri Light" w:hAnsi="Calibri Light" w:cs="Calibri Light"/>
-          <w:sz w:val="20"/>
-          <w:szCs w:val="21"/>
-          <w:lang w:eastAsia="ko-KR"/>
-        </w:rPr>
-        <w:t xml:space="preserve">, W. (2019) Identifying behavioral and neural predictors of caffeinated soda intake in childhood using a large database from the ABCD study, </w:t>
-      </w:r>
-      <w:r>
-        <w:rPr>
-          <w:rFonts w:ascii="Calibri Light" w:hAnsi="Calibri Light" w:cs="Calibri Light"/>
-          <w:i/>
-          <w:iCs/>
-          <w:sz w:val="20"/>
-          <w:szCs w:val="21"/>
-          <w:lang w:eastAsia="ko-KR"/>
-        </w:rPr>
-        <w:t xml:space="preserve">Poster presented at </w:t>
-      </w:r>
-      <w:r>
-        <w:rPr>
-          <w:rFonts w:ascii="Calibri Light" w:hAnsi="Calibri Light" w:cs="Calibri Light"/>
-          <w:i/>
-          <w:iCs/>
-          <w:sz w:val="20"/>
-          <w:szCs w:val="21"/>
-          <w:lang w:eastAsia="ko-KR"/>
-        </w:rPr>
-        <w:t>the Annual Meeting of the Society for Neuroscience, Chicago (Presented by the 2</w:t>
-      </w:r>
-      <w:r>
-        <w:rPr>
-          <w:rFonts w:ascii="Calibri Light" w:hAnsi="Calibri Light" w:cs="Calibri Light"/>
-          <w:i/>
-          <w:iCs/>
-          <w:sz w:val="20"/>
-          <w:szCs w:val="21"/>
-          <w:vertAlign w:val="superscript"/>
-          <w:lang w:eastAsia="ko-KR"/>
-        </w:rPr>
-        <w:t>nd</w:t>
-      </w:r>
-      <w:r>
-        <w:rPr>
-          <w:rFonts w:ascii="Calibri Light" w:hAnsi="Calibri Light" w:cs="Calibri Light"/>
-          <w:i/>
-          <w:iCs/>
-          <w:sz w:val="20"/>
-          <w:szCs w:val="21"/>
-          <w:lang w:eastAsia="ko-KR"/>
-        </w:rPr>
-        <w:t xml:space="preserve"> Author)</w:t>
-      </w:r>
-      <w:r>
-        <w:rPr>
-          <w:rFonts w:ascii="Calibri Light" w:hAnsi="Calibri Light" w:cs="Calibri Light"/>
-          <w:i/>
-          <w:iCs/>
-          <w:sz w:val="20"/>
-          <w:szCs w:val="21"/>
-          <w:lang w:eastAsia="ko-KR"/>
-        </w:rPr>
-        <w:t>.</w:t>
+        <w:t>, W. (202</w:t>
+      </w:r>
+      <w:r>
+        <w:rPr>
+          <w:rFonts w:ascii="Calibri Light" w:hAnsi="Calibri Light" w:cs="Calibri Light"/>
+          <w:sz w:val="20"/>
+          <w:szCs w:val="21"/>
+          <w:lang w:eastAsia="ko-KR"/>
+        </w:rPr>
+        <w:t>1) Identifying unique neurocognitive mechanisms of food addiction and binge eating using longitudinal study design and computational modeling</w:t>
+      </w:r>
+      <w:r>
+        <w:rPr>
+          <w:rFonts w:ascii="Calibri Light" w:hAnsi="Calibri Light" w:cs="Calibri Light"/>
+          <w:sz w:val="20"/>
+          <w:szCs w:val="21"/>
+          <w:lang w:eastAsia="ko-KR"/>
+        </w:rPr>
+        <w:t>,</w:t>
       </w:r>
       <w:r>
         <w:rPr>
@@ -1080,6 +1150,37 @@
           <w:lang w:eastAsia="ko-KR"/>
         </w:rPr>
         <w:t xml:space="preserve"> </w:t>
+      </w:r>
+      <w:r>
+        <w:rPr>
+          <w:rFonts w:ascii="Calibri Light" w:hAnsi="Calibri Light" w:cs="Calibri Light"/>
+          <w:i/>
+          <w:iCs/>
+          <w:sz w:val="20"/>
+          <w:szCs w:val="21"/>
+          <w:lang w:eastAsia="ko-KR"/>
+        </w:rPr>
+        <w:t>Abstract submitted for oral or poster presentation at Society for Neuroscience</w:t>
+      </w:r>
+      <w:r>
+        <w:rPr>
+          <w:rFonts w:ascii="Calibri Light" w:hAnsi="Calibri Light" w:cs="Calibri Light"/>
+          <w:sz w:val="20"/>
+          <w:szCs w:val="21"/>
+          <w:lang w:eastAsia="ko-KR"/>
+        </w:rPr>
+        <w:t xml:space="preserve">, </w:t>
+      </w:r>
+      <w:r>
+        <w:rPr>
+          <w:rFonts w:ascii="Calibri Light" w:hAnsi="Calibri Light" w:cs="Calibri Light"/>
+          <w:i/>
+          <w:iCs/>
+          <w:sz w:val="20"/>
+          <w:szCs w:val="21"/>
+          <w:lang w:eastAsia="ko-KR"/>
+        </w:rPr>
+        <w:t xml:space="preserve">Chicago. </w:t>
       </w:r>
     </w:p>
     <w:p>
@@ -1099,6 +1200,15 @@
       <w:r>
         <w:rPr>
           <w:rFonts w:ascii="Calibri Light" w:hAnsi="Calibri Light" w:cs="Calibri Light"/>
+          <w:sz w:val="20"/>
+          <w:szCs w:val="21"/>
+          <w:lang w:eastAsia="ko-KR"/>
+        </w:rPr>
+        <w:t xml:space="preserve">Park, H., Choi, H., </w:t>
+      </w:r>
+      <w:r>
+        <w:rPr>
+          <w:rFonts w:ascii="Calibri Light" w:hAnsi="Calibri Light" w:cs="Calibri Light"/>
           <w:b/>
           <w:bCs/>
           <w:sz w:val="20"/>
@@ -1116,15 +1226,6 @@
         </w:rPr>
         <w:t xml:space="preserve">, </w:t>
       </w:r>
-      <w:r>
-        <w:rPr>
-          <w:rFonts w:ascii="Calibri Light" w:hAnsi="Calibri Light" w:cs="Calibri Light"/>
-          <w:sz w:val="20"/>
-          <w:szCs w:val="21"/>
-          <w:lang w:eastAsia="ko-KR"/>
-        </w:rPr>
-        <w:t xml:space="preserve">Kim, H., Yang, J., &amp; </w:t>
-      </w:r>
       <w:proofErr w:type="spellStart"/>
       <w:r>
         <w:rPr>
@@ -1143,45 +1244,40 @@
           <w:szCs w:val="21"/>
           <w:lang w:eastAsia="ko-KR"/>
         </w:rPr>
-        <w:t xml:space="preserve">, W. (2019) </w:t>
-      </w:r>
-      <w:r>
-        <w:rPr>
-          <w:rFonts w:ascii="Calibri Light" w:hAnsi="Calibri Light" w:cs="Calibri Light"/>
-          <w:sz w:val="20"/>
-          <w:szCs w:val="21"/>
-          <w:lang w:eastAsia="ko-KR"/>
-        </w:rPr>
-        <w:t>Caffeinated soda intake in childhood is associated with risk factors of Substance Use Disorder</w:t>
-      </w:r>
-      <w:r>
-        <w:rPr>
-          <w:rFonts w:ascii="Calibri Light" w:hAnsi="Calibri Light" w:cs="Calibri Light"/>
-          <w:sz w:val="20"/>
-          <w:szCs w:val="21"/>
-          <w:lang w:eastAsia="ko-KR"/>
-        </w:rPr>
-        <w:t xml:space="preserve">, </w:t>
-      </w:r>
-      <w:r>
-        <w:rPr>
-          <w:rFonts w:ascii="Calibri Light" w:hAnsi="Calibri Light" w:cs="Calibri Light"/>
-          <w:i/>
-          <w:iCs/>
-          <w:sz w:val="20"/>
-          <w:szCs w:val="21"/>
-          <w:lang w:eastAsia="ko-KR"/>
-        </w:rPr>
-        <w:t>Poster presented at the Annual Meeting of The Korean Cognitive Science Society, Seoul, South Korea.</w:t>
-      </w:r>
-      <w:r>
-        <w:rPr>
-          <w:rFonts w:ascii="Calibri Light" w:hAnsi="Calibri Light" w:cs="Calibri Light"/>
-          <w:sz w:val="20"/>
-          <w:szCs w:val="21"/>
-          <w:lang w:eastAsia="ko-KR"/>
-        </w:rPr>
-        <w:t xml:space="preserve"> </w:t>
+        <w:t xml:space="preserve">, W., &amp; Jung, Y. (2020) Neural Correlates of Goal-Directed Control in Interest Gaming Disorder and Alcohol Use Disorder, </w:t>
+      </w:r>
+      <w:r>
+        <w:rPr>
+          <w:rFonts w:ascii="Calibri Light" w:hAnsi="Calibri Light" w:cs="Calibri Light"/>
+          <w:i/>
+          <w:iCs/>
+          <w:sz w:val="20"/>
+          <w:szCs w:val="21"/>
+          <w:lang w:eastAsia="ko-KR"/>
+        </w:rPr>
+        <w:t>E-Poster registration at the Annual Meeting of the Society of Biological Psychiatry</w:t>
+      </w:r>
+      <w:r>
+        <w:rPr>
+          <w:rFonts w:ascii="Calibri Light" w:hAnsi="Calibri Light" w:cs="Calibri Light"/>
+          <w:i/>
+          <w:iCs/>
+          <w:sz w:val="20"/>
+          <w:szCs w:val="21"/>
+          <w:lang w:eastAsia="ko-KR"/>
+        </w:rPr>
+        <w:t>, New York</w:t>
+      </w:r>
+      <w:r>
+        <w:rPr>
+          <w:rFonts w:ascii="Calibri Light" w:hAnsi="Calibri Light" w:cs="Calibri Light"/>
+          <w:i/>
+          <w:iCs/>
+          <w:sz w:val="20"/>
+          <w:szCs w:val="21"/>
+          <w:lang w:eastAsia="ko-KR"/>
+        </w:rPr>
+        <w:t>.</w:t>
       </w:r>
       <w:r>
         <w:rPr>
@@ -1201,30 +1297,397 @@
         <w:spacing w:after="80"/>
         <w:ind w:left="567" w:hanging="567"/>
         <w:rPr>
-          <w:rFonts w:ascii="Lato Light" w:hAnsi="Lato Light" w:cstheme="minorHAnsi"/>
-          <w:sz w:val="20"/>
-          <w:szCs w:val="21"/>
-          <w:lang w:eastAsia="ko-KR"/>
-        </w:rPr>
-      </w:pPr>
-    </w:p>
-    <w:p>
-      <w:pPr>
-        <w:pStyle w:val="Heading1"/>
+          <w:rFonts w:ascii="Calibri Light" w:hAnsi="Calibri Light" w:cs="Calibri Light"/>
+          <w:sz w:val="20"/>
+          <w:szCs w:val="21"/>
+          <w:lang w:eastAsia="ko-KR"/>
+        </w:rPr>
+      </w:pPr>
+      <w:r>
+        <w:rPr>
+          <w:rFonts w:ascii="Calibri Light" w:hAnsi="Calibri Light" w:cs="Calibri Light"/>
+          <w:b/>
+          <w:bCs/>
+          <w:sz w:val="20"/>
+          <w:szCs w:val="21"/>
+          <w:lang w:eastAsia="ko-KR"/>
+        </w:rPr>
+        <w:t>Kwon, M.</w:t>
+      </w:r>
+      <w:r>
+        <w:rPr>
+          <w:rFonts w:ascii="Calibri Light" w:hAnsi="Calibri Light" w:cs="Calibri Light"/>
+          <w:sz w:val="20"/>
+          <w:szCs w:val="21"/>
+          <w:lang w:eastAsia="ko-KR"/>
+        </w:rPr>
+        <w:t xml:space="preserve">, Kim, H., Yang, J., </w:t>
+      </w:r>
+      <w:proofErr w:type="spellStart"/>
+      <w:r>
+        <w:rPr>
+          <w:rFonts w:ascii="Calibri Light" w:hAnsi="Calibri Light" w:cs="Calibri Light"/>
+          <w:sz w:val="20"/>
+          <w:szCs w:val="21"/>
+          <w:lang w:eastAsia="ko-KR"/>
+        </w:rPr>
+        <w:t>Hur</w:t>
+      </w:r>
+      <w:proofErr w:type="spellEnd"/>
+      <w:r>
+        <w:rPr>
+          <w:rFonts w:ascii="Calibri Light" w:hAnsi="Calibri Light" w:cs="Calibri Light"/>
+          <w:sz w:val="20"/>
+          <w:szCs w:val="21"/>
+          <w:lang w:eastAsia="ko-KR"/>
+        </w:rPr>
+        <w:t xml:space="preserve">, J., Lee, T., &amp; </w:t>
+      </w:r>
+      <w:proofErr w:type="spellStart"/>
+      <w:r>
+        <w:rPr>
+          <w:rFonts w:ascii="Calibri Light" w:hAnsi="Calibri Light" w:cs="Calibri Light"/>
+          <w:sz w:val="20"/>
+          <w:szCs w:val="21"/>
+          <w:lang w:eastAsia="ko-KR"/>
+        </w:rPr>
+        <w:t>Ahn</w:t>
+      </w:r>
+      <w:proofErr w:type="spellEnd"/>
+      <w:r>
+        <w:rPr>
+          <w:rFonts w:ascii="Calibri Light" w:hAnsi="Calibri Light" w:cs="Calibri Light"/>
+          <w:sz w:val="20"/>
+          <w:szCs w:val="21"/>
+          <w:lang w:eastAsia="ko-KR"/>
+        </w:rPr>
+        <w:t xml:space="preserve">, W. (2019) Identifying behavioral and neural predictors of caffeinated soda intake in childhood using a large database from the ABCD study, </w:t>
+      </w:r>
+      <w:r>
+        <w:rPr>
+          <w:rFonts w:ascii="Calibri Light" w:hAnsi="Calibri Light" w:cs="Calibri Light"/>
+          <w:i/>
+          <w:iCs/>
+          <w:sz w:val="20"/>
+          <w:szCs w:val="21"/>
+          <w:lang w:eastAsia="ko-KR"/>
+        </w:rPr>
+        <w:t xml:space="preserve">Poster presented at </w:t>
+      </w:r>
+      <w:r>
+        <w:rPr>
+          <w:rFonts w:ascii="Calibri Light" w:hAnsi="Calibri Light" w:cs="Calibri Light"/>
+          <w:i/>
+          <w:iCs/>
+          <w:sz w:val="20"/>
+          <w:szCs w:val="21"/>
+          <w:lang w:eastAsia="ko-KR"/>
+        </w:rPr>
+        <w:t>the Annual Meeting of the Society for Neuroscience, Chicago (Presented by the 2</w:t>
+      </w:r>
+      <w:r>
+        <w:rPr>
+          <w:rFonts w:ascii="Calibri Light" w:hAnsi="Calibri Light" w:cs="Calibri Light"/>
+          <w:i/>
+          <w:iCs/>
+          <w:sz w:val="20"/>
+          <w:szCs w:val="21"/>
+          <w:vertAlign w:val="superscript"/>
+          <w:lang w:eastAsia="ko-KR"/>
+        </w:rPr>
+        <w:t>nd</w:t>
+      </w:r>
+      <w:r>
+        <w:rPr>
+          <w:rFonts w:ascii="Calibri Light" w:hAnsi="Calibri Light" w:cs="Calibri Light"/>
+          <w:i/>
+          <w:iCs/>
+          <w:sz w:val="20"/>
+          <w:szCs w:val="21"/>
+          <w:lang w:eastAsia="ko-KR"/>
+        </w:rPr>
+        <w:t xml:space="preserve"> Author)</w:t>
+      </w:r>
+      <w:r>
+        <w:rPr>
+          <w:rFonts w:ascii="Calibri Light" w:hAnsi="Calibri Light" w:cs="Calibri Light"/>
+          <w:i/>
+          <w:iCs/>
+          <w:sz w:val="20"/>
+          <w:szCs w:val="21"/>
+          <w:lang w:eastAsia="ko-KR"/>
+        </w:rPr>
+        <w:t>.</w:t>
+      </w:r>
+      <w:r>
+        <w:rPr>
+          <w:rFonts w:ascii="Calibri Light" w:hAnsi="Calibri Light" w:cs="Calibri Light"/>
+          <w:sz w:val="20"/>
+          <w:szCs w:val="21"/>
+          <w:lang w:eastAsia="ko-KR"/>
+        </w:rPr>
+        <w:t xml:space="preserve"> </w:t>
+      </w:r>
+    </w:p>
+    <w:p>
+      <w:pPr>
+        <w:tabs>
+          <w:tab w:val="right" w:pos="8640"/>
+        </w:tabs>
+        <w:spacing w:after="80"/>
+        <w:ind w:left="567" w:hanging="567"/>
+        <w:rPr>
+          <w:rFonts w:ascii="Calibri Light" w:hAnsi="Calibri Light" w:cs="Calibri Light"/>
+          <w:sz w:val="20"/>
+          <w:szCs w:val="21"/>
+          <w:lang w:eastAsia="ko-KR"/>
+        </w:rPr>
+      </w:pPr>
+      <w:r>
+        <w:rPr>
+          <w:rFonts w:ascii="Calibri Light" w:hAnsi="Calibri Light" w:cs="Calibri Light"/>
+          <w:sz w:val="20"/>
+          <w:szCs w:val="21"/>
+          <w:lang w:eastAsia="ko-KR"/>
+        </w:rPr>
+        <w:t xml:space="preserve">Kim, H.+, Kim, S.+, </w:t>
+      </w:r>
+      <w:r>
+        <w:rPr>
+          <w:rFonts w:ascii="Calibri Light" w:hAnsi="Calibri Light" w:cs="Calibri Light"/>
+          <w:b/>
+          <w:bCs/>
+          <w:sz w:val="20"/>
+          <w:szCs w:val="21"/>
+          <w:lang w:eastAsia="ko-KR"/>
+        </w:rPr>
+        <w:t>Kwon, M.</w:t>
+      </w:r>
+      <w:r>
+        <w:rPr>
+          <w:rFonts w:ascii="Calibri Light" w:hAnsi="Calibri Light" w:cs="Calibri Light"/>
+          <w:sz w:val="20"/>
+          <w:szCs w:val="21"/>
+          <w:lang w:eastAsia="ko-KR"/>
+        </w:rPr>
+        <w:t xml:space="preserve">, Yang, </w:t>
+      </w:r>
+      <w:r>
+        <w:rPr>
+          <w:rFonts w:ascii="Calibri Light" w:hAnsi="Calibri Light" w:cs="Calibri Light"/>
+          <w:sz w:val="20"/>
+          <w:szCs w:val="21"/>
+          <w:lang w:eastAsia="ko-KR"/>
+        </w:rPr>
+        <w:t>J</w:t>
+      </w:r>
+      <w:r>
+        <w:rPr>
+          <w:rFonts w:ascii="Calibri Light" w:hAnsi="Calibri Light" w:cs="Calibri Light"/>
+          <w:sz w:val="20"/>
+          <w:szCs w:val="21"/>
+          <w:lang w:eastAsia="ko-KR"/>
+        </w:rPr>
+        <w:t xml:space="preserve">., &amp; </w:t>
+      </w:r>
+      <w:proofErr w:type="spellStart"/>
+      <w:r>
+        <w:rPr>
+          <w:rFonts w:ascii="Calibri Light" w:hAnsi="Calibri Light" w:cs="Calibri Light"/>
+          <w:sz w:val="20"/>
+          <w:szCs w:val="21"/>
+          <w:lang w:eastAsia="ko-KR"/>
+        </w:rPr>
+        <w:t>Ahn</w:t>
+      </w:r>
+      <w:proofErr w:type="spellEnd"/>
+      <w:r>
+        <w:rPr>
+          <w:rFonts w:ascii="Calibri Light" w:hAnsi="Calibri Light" w:cs="Calibri Light"/>
+          <w:sz w:val="20"/>
+          <w:szCs w:val="21"/>
+          <w:lang w:eastAsia="ko-KR"/>
+        </w:rPr>
+        <w:t xml:space="preserve">, W. (2019) Effects of early life stress and social resources on neurocognitive functions: A large-scale replication study, </w:t>
+      </w:r>
+      <w:r>
+        <w:rPr>
+          <w:rFonts w:ascii="Calibri Light" w:hAnsi="Calibri Light" w:cs="Calibri Light"/>
+          <w:i/>
+          <w:iCs/>
+          <w:sz w:val="20"/>
+          <w:szCs w:val="21"/>
+          <w:lang w:eastAsia="ko-KR"/>
+        </w:rPr>
+        <w:t>Society for Research in Psychopathology</w:t>
+      </w:r>
+      <w:r>
+        <w:rPr>
+          <w:rFonts w:ascii="Calibri Light" w:hAnsi="Calibri Light" w:cs="Calibri Light"/>
+          <w:i/>
+          <w:iCs/>
+          <w:sz w:val="20"/>
+          <w:szCs w:val="21"/>
+          <w:lang w:eastAsia="ko-KR"/>
+        </w:rPr>
+        <w:t xml:space="preserve">, New York. </w:t>
+      </w:r>
+    </w:p>
+    <w:p>
+      <w:pPr>
+        <w:tabs>
+          <w:tab w:val="right" w:pos="8640"/>
+        </w:tabs>
+        <w:spacing w:after="80"/>
+        <w:ind w:left="567" w:hanging="567"/>
+        <w:rPr>
+          <w:rFonts w:ascii="Calibri Light" w:hAnsi="Calibri Light" w:cs="Calibri Light"/>
+          <w:sz w:val="20"/>
+          <w:szCs w:val="21"/>
+          <w:lang w:eastAsia="ko-KR"/>
+        </w:rPr>
+      </w:pPr>
+      <w:r>
+        <w:rPr>
+          <w:rFonts w:ascii="Calibri Light" w:hAnsi="Calibri Light" w:cs="Calibri Light"/>
+          <w:b/>
+          <w:bCs/>
+          <w:sz w:val="20"/>
+          <w:szCs w:val="21"/>
+          <w:lang w:eastAsia="ko-KR"/>
+        </w:rPr>
+        <w:lastRenderedPageBreak/>
+        <w:t>Kwon, M.</w:t>
+      </w:r>
+      <w:r>
+        <w:rPr>
+          <w:rFonts w:ascii="Calibri Light" w:hAnsi="Calibri Light" w:cs="Calibri Light"/>
+          <w:sz w:val="20"/>
+          <w:szCs w:val="21"/>
+          <w:lang w:eastAsia="ko-KR"/>
+        </w:rPr>
+        <w:t xml:space="preserve">, </w:t>
+      </w:r>
+      <w:r>
+        <w:rPr>
+          <w:rFonts w:ascii="Calibri Light" w:hAnsi="Calibri Light" w:cs="Calibri Light"/>
+          <w:sz w:val="20"/>
+          <w:szCs w:val="21"/>
+          <w:lang w:eastAsia="ko-KR"/>
+        </w:rPr>
+        <w:t xml:space="preserve">Kim, H., Yang, J., &amp; </w:t>
+      </w:r>
+      <w:proofErr w:type="spellStart"/>
+      <w:r>
+        <w:rPr>
+          <w:rFonts w:ascii="Calibri Light" w:hAnsi="Calibri Light" w:cs="Calibri Light"/>
+          <w:sz w:val="20"/>
+          <w:szCs w:val="21"/>
+          <w:lang w:eastAsia="ko-KR"/>
+        </w:rPr>
+        <w:t>Ahn</w:t>
+      </w:r>
+      <w:proofErr w:type="spellEnd"/>
+      <w:r>
+        <w:rPr>
+          <w:rFonts w:ascii="Calibri Light" w:hAnsi="Calibri Light" w:cs="Calibri Light"/>
+          <w:sz w:val="20"/>
+          <w:szCs w:val="21"/>
+          <w:lang w:eastAsia="ko-KR"/>
+        </w:rPr>
+        <w:t xml:space="preserve">, W. (2019) </w:t>
+      </w:r>
+      <w:r>
+        <w:rPr>
+          <w:rFonts w:ascii="Calibri Light" w:hAnsi="Calibri Light" w:cs="Calibri Light"/>
+          <w:sz w:val="20"/>
+          <w:szCs w:val="21"/>
+          <w:lang w:eastAsia="ko-KR"/>
+        </w:rPr>
+        <w:t>Caffeinated soda intake in childhood is associated with risk factors of Substance Use Disorder</w:t>
+      </w:r>
+      <w:r>
+        <w:rPr>
+          <w:rFonts w:ascii="Calibri Light" w:hAnsi="Calibri Light" w:cs="Calibri Light"/>
+          <w:sz w:val="20"/>
+          <w:szCs w:val="21"/>
+          <w:lang w:eastAsia="ko-KR"/>
+        </w:rPr>
+        <w:t xml:space="preserve">, </w:t>
+      </w:r>
+      <w:r>
+        <w:rPr>
+          <w:rFonts w:ascii="Calibri Light" w:hAnsi="Calibri Light" w:cs="Calibri Light"/>
+          <w:i/>
+          <w:iCs/>
+          <w:sz w:val="20"/>
+          <w:szCs w:val="21"/>
+          <w:lang w:eastAsia="ko-KR"/>
+        </w:rPr>
+        <w:t>Poster presented at the Annual Meeting of The Korean Cognitive Science Society, Seoul, South Korea.</w:t>
+      </w:r>
+      <w:r>
+        <w:rPr>
+          <w:rFonts w:ascii="Calibri Light" w:hAnsi="Calibri Light" w:cs="Calibri Light"/>
+          <w:sz w:val="20"/>
+          <w:szCs w:val="21"/>
+          <w:lang w:eastAsia="ko-KR"/>
+        </w:rPr>
+        <w:t xml:space="preserve"> </w:t>
+      </w:r>
+      <w:r>
+        <w:rPr>
+          <w:rFonts w:ascii="Calibri Light" w:hAnsi="Calibri Light" w:cs="Calibri Light"/>
+          <w:sz w:val="20"/>
+          <w:szCs w:val="21"/>
+          <w:lang w:eastAsia="ko-KR"/>
+        </w:rPr>
+        <w:t xml:space="preserve"> </w:t>
+      </w:r>
+    </w:p>
+    <w:p>
+      <w:pPr>
+        <w:tabs>
+          <w:tab w:val="right" w:pos="8640"/>
+        </w:tabs>
+        <w:spacing w:after="80"/>
+        <w:ind w:left="567" w:hanging="567"/>
         <w:rPr>
           <w:rFonts w:ascii="Lato" w:hAnsi="Lato" w:cstheme="minorHAnsi"/>
           <w:sz w:val="22"/>
           <w:szCs w:val="28"/>
         </w:rPr>
       </w:pPr>
-      <w:r>
+    </w:p>
+    <w:p>
+      <w:pPr>
+        <w:pStyle w:val="Heading1"/>
         <w:rPr>
           <w:rFonts w:ascii="Lato" w:hAnsi="Lato" w:cstheme="minorHAnsi"/>
           <w:sz w:val="22"/>
           <w:szCs w:val="28"/>
         </w:rPr>
+      </w:pPr>
+      <w:r>
+        <w:rPr>
+          <w:rFonts w:ascii="Lato" w:hAnsi="Lato" w:cstheme="minorHAnsi"/>
+          <w:sz w:val="22"/>
+          <w:szCs w:val="28"/>
+        </w:rPr>
         <w:t>Teaching</w:t>
       </w:r>
+    </w:p>
+    <w:p>
+      <w:pPr>
+        <w:tabs>
+          <w:tab w:val="right" w:pos="8640"/>
+        </w:tabs>
+        <w:rPr>
+          <w:rFonts w:ascii="Lato" w:hAnsi="Lato" w:cstheme="minorHAnsi"/>
+          <w:sz w:val="16"/>
+          <w:szCs w:val="16"/>
+        </w:rPr>
+      </w:pPr>
     </w:p>
     <w:p>
       <w:pPr>
@@ -1321,6 +1784,410 @@
           <w:szCs w:val="16"/>
           <w:lang w:eastAsia="ko-KR"/>
         </w:rPr>
+        <w:t>202</w:t>
+      </w:r>
+      <w:r>
+        <w:rPr>
+          <w:rFonts w:ascii="Calibri Light" w:hAnsi="Calibri Light" w:cs="Calibri Light"/>
+          <w:i/>
+          <w:iCs/>
+          <w:sz w:val="16"/>
+          <w:szCs w:val="16"/>
+          <w:lang w:eastAsia="ko-KR"/>
+        </w:rPr>
+        <w:t>1</w:t>
+      </w:r>
+      <w:r>
+        <w:rPr>
+          <w:rFonts w:ascii="Calibri Light" w:hAnsi="Calibri Light" w:cs="Calibri Light"/>
+          <w:i/>
+          <w:iCs/>
+          <w:sz w:val="16"/>
+          <w:szCs w:val="16"/>
+          <w:lang w:eastAsia="ko-KR"/>
+        </w:rPr>
+        <w:t xml:space="preserve">.03 ~ </w:t>
+      </w:r>
+      <w:r>
+        <w:rPr>
+          <w:rFonts w:ascii="Calibri Light" w:hAnsi="Calibri Light" w:cs="Calibri Light"/>
+          <w:i/>
+          <w:iCs/>
+          <w:sz w:val="16"/>
+          <w:szCs w:val="16"/>
+        </w:rPr>
+        <w:t>present</w:t>
+      </w:r>
+    </w:p>
+    <w:p>
+      <w:pPr>
+        <w:tabs>
+          <w:tab w:val="right" w:pos="8640"/>
+        </w:tabs>
+        <w:rPr>
+          <w:rFonts w:ascii="Calibri Light" w:hAnsi="Calibri Light" w:cs="Calibri Light"/>
+          <w:i/>
+          <w:iCs/>
+          <w:sz w:val="16"/>
+          <w:szCs w:val="16"/>
+          <w:lang w:eastAsia="ko-KR"/>
+        </w:rPr>
+      </w:pPr>
+      <w:r>
+        <w:rPr>
+          <w:rFonts w:ascii="Calibri Light" w:hAnsi="Calibri Light" w:cs="Calibri Light"/>
+          <w:i/>
+          <w:iCs/>
+          <w:sz w:val="16"/>
+          <w:szCs w:val="16"/>
+        </w:rPr>
+        <w:t>Seminar in Experimental Psychology</w:t>
+      </w:r>
+      <w:r>
+        <w:rPr>
+          <w:rFonts w:ascii="Calibri Light" w:hAnsi="Calibri Light" w:cs="Calibri Light"/>
+          <w:i/>
+          <w:iCs/>
+          <w:sz w:val="16"/>
+          <w:szCs w:val="16"/>
+        </w:rPr>
+        <w:t>: Computational Modeling</w:t>
+      </w:r>
+    </w:p>
+    <w:p>
+      <w:pPr>
+        <w:tabs>
+          <w:tab w:val="right" w:pos="8640"/>
+        </w:tabs>
+        <w:rPr>
+          <w:rFonts w:ascii="Calibri" w:hAnsi="Calibri" w:cs="Calibri"/>
+          <w:b/>
+          <w:bCs/>
+          <w:sz w:val="20"/>
+          <w:szCs w:val="20"/>
+          <w:lang w:eastAsia="ko-KR"/>
+        </w:rPr>
+      </w:pPr>
+    </w:p>
+    <w:p>
+      <w:pPr>
+        <w:tabs>
+          <w:tab w:val="right" w:pos="8640"/>
+        </w:tabs>
+        <w:rPr>
+          <w:rFonts w:ascii="Calibri" w:hAnsi="Calibri" w:cs="Calibri"/>
+          <w:sz w:val="21"/>
+          <w:szCs w:val="21"/>
+          <w:lang w:eastAsia="ko-KR"/>
+        </w:rPr>
+      </w:pPr>
+      <w:r>
+        <w:rPr>
+          <w:rFonts w:ascii="Calibri" w:hAnsi="Calibri" w:cs="Calibri"/>
+          <w:b/>
+          <w:bCs/>
+          <w:sz w:val="20"/>
+          <w:szCs w:val="20"/>
+          <w:lang w:eastAsia="ko-KR"/>
+        </w:rPr>
+        <w:t>Seoul National University</w:t>
+      </w:r>
+      <w:r>
+        <w:rPr>
+          <w:rFonts w:ascii="Calibri" w:hAnsi="Calibri" w:cs="Calibri"/>
+          <w:b/>
+          <w:sz w:val="20"/>
+          <w:szCs w:val="20"/>
+          <w:lang w:eastAsia="ko-KR"/>
+        </w:rPr>
+        <w:tab/>
+      </w:r>
+      <w:r>
+        <w:rPr>
+          <w:rFonts w:ascii="Calibri Light" w:hAnsi="Calibri Light" w:cs="Calibri Light"/>
+          <w:sz w:val="16"/>
+          <w:szCs w:val="16"/>
+          <w:lang w:eastAsia="ko-KR"/>
+        </w:rPr>
+        <w:t>Seoul, Korea</w:t>
+      </w:r>
+    </w:p>
+    <w:p>
+      <w:pPr>
+        <w:tabs>
+          <w:tab w:val="right" w:pos="8640"/>
+        </w:tabs>
+        <w:rPr>
+          <w:rFonts w:ascii="Calibri Light" w:hAnsi="Calibri Light" w:cs="Calibri Light"/>
+          <w:i/>
+          <w:iCs/>
+          <w:sz w:val="16"/>
+          <w:szCs w:val="16"/>
+        </w:rPr>
+      </w:pPr>
+      <w:r>
+        <w:rPr>
+          <w:rFonts w:ascii="Calibri Light" w:hAnsi="Calibri Light" w:cs="Calibri Light"/>
+          <w:sz w:val="16"/>
+          <w:szCs w:val="16"/>
+          <w:lang w:eastAsia="ko-KR"/>
+        </w:rPr>
+        <w:t xml:space="preserve">Teaching Assistant </w:t>
+      </w:r>
+      <w:r>
+        <w:rPr>
+          <w:rFonts w:ascii="Calibri Light" w:hAnsi="Calibri Light" w:cs="Calibri Light"/>
+          <w:sz w:val="16"/>
+          <w:szCs w:val="16"/>
+          <w:lang w:eastAsia="ko-KR"/>
+        </w:rPr>
+        <w:tab/>
+      </w:r>
+      <w:r>
+        <w:rPr>
+          <w:rFonts w:ascii="Calibri Light" w:hAnsi="Calibri Light" w:cs="Calibri Light"/>
+          <w:i/>
+          <w:iCs/>
+          <w:sz w:val="16"/>
+          <w:szCs w:val="16"/>
+          <w:lang w:eastAsia="ko-KR"/>
+        </w:rPr>
+        <w:t>202</w:t>
+      </w:r>
+      <w:r>
+        <w:rPr>
+          <w:rFonts w:ascii="Calibri Light" w:hAnsi="Calibri Light" w:cs="Calibri Light"/>
+          <w:i/>
+          <w:iCs/>
+          <w:sz w:val="16"/>
+          <w:szCs w:val="16"/>
+          <w:lang w:eastAsia="ko-KR"/>
+        </w:rPr>
+        <w:t>1</w:t>
+      </w:r>
+      <w:r>
+        <w:rPr>
+          <w:rFonts w:ascii="Calibri Light" w:hAnsi="Calibri Light" w:cs="Calibri Light"/>
+          <w:i/>
+          <w:iCs/>
+          <w:sz w:val="16"/>
+          <w:szCs w:val="16"/>
+          <w:lang w:eastAsia="ko-KR"/>
+        </w:rPr>
+        <w:t xml:space="preserve">.03 ~ </w:t>
+      </w:r>
+      <w:r>
+        <w:rPr>
+          <w:rFonts w:ascii="Calibri Light" w:hAnsi="Calibri Light" w:cs="Calibri Light"/>
+          <w:i/>
+          <w:iCs/>
+          <w:sz w:val="16"/>
+          <w:szCs w:val="16"/>
+        </w:rPr>
+        <w:t>present</w:t>
+      </w:r>
+    </w:p>
+    <w:p>
+      <w:pPr>
+        <w:tabs>
+          <w:tab w:val="right" w:pos="8640"/>
+        </w:tabs>
+        <w:rPr>
+          <w:rFonts w:ascii="Calibri Light" w:hAnsi="Calibri Light" w:cs="Calibri Light"/>
+          <w:i/>
+          <w:iCs/>
+          <w:sz w:val="16"/>
+          <w:szCs w:val="16"/>
+        </w:rPr>
+      </w:pPr>
+      <w:r>
+        <w:rPr>
+          <w:rFonts w:ascii="Calibri Light" w:hAnsi="Calibri Light" w:cs="Calibri Light"/>
+          <w:i/>
+          <w:iCs/>
+          <w:sz w:val="16"/>
+          <w:szCs w:val="16"/>
+        </w:rPr>
+        <w:t>Psychological Science of Addiction</w:t>
+      </w:r>
+    </w:p>
+    <w:p>
+      <w:pPr>
+        <w:tabs>
+          <w:tab w:val="right" w:pos="8640"/>
+        </w:tabs>
+        <w:rPr>
+          <w:rFonts w:ascii="Calibri" w:hAnsi="Calibri" w:cs="Calibri"/>
+          <w:b/>
+          <w:bCs/>
+          <w:sz w:val="20"/>
+          <w:szCs w:val="20"/>
+          <w:lang w:eastAsia="ko-KR"/>
+        </w:rPr>
+      </w:pPr>
+    </w:p>
+    <w:p>
+      <w:pPr>
+        <w:rPr>
+          <w:rFonts w:ascii="Calibri" w:hAnsi="Calibri" w:cs="Calibri"/>
+          <w:b/>
+          <w:bCs/>
+          <w:sz w:val="20"/>
+          <w:szCs w:val="20"/>
+          <w:lang w:eastAsia="ko-KR"/>
+        </w:rPr>
+      </w:pPr>
+      <w:r>
+        <w:rPr>
+          <w:rFonts w:ascii="Calibri" w:hAnsi="Calibri" w:cs="Calibri"/>
+          <w:b/>
+          <w:bCs/>
+          <w:sz w:val="20"/>
+          <w:szCs w:val="20"/>
+          <w:lang w:eastAsia="ko-KR"/>
+        </w:rPr>
+        <w:t>Seoul National University</w:t>
+      </w:r>
+      <w:r>
+        <w:rPr>
+          <w:rFonts w:ascii="Calibri" w:hAnsi="Calibri" w:cs="Calibri"/>
+          <w:b/>
+          <w:sz w:val="20"/>
+          <w:szCs w:val="20"/>
+          <w:lang w:eastAsia="ko-KR"/>
+        </w:rPr>
+        <w:tab/>
+      </w:r>
+      <w:r>
+        <w:rPr>
+          <w:rFonts w:ascii="Calibri" w:hAnsi="Calibri" w:cs="Calibri"/>
+          <w:b/>
+          <w:sz w:val="20"/>
+          <w:szCs w:val="20"/>
+          <w:lang w:eastAsia="ko-KR"/>
+        </w:rPr>
+        <w:tab/>
+      </w:r>
+      <w:r>
+        <w:rPr>
+          <w:rFonts w:ascii="Calibri" w:hAnsi="Calibri" w:cs="Calibri"/>
+          <w:b/>
+          <w:sz w:val="20"/>
+          <w:szCs w:val="20"/>
+          <w:lang w:eastAsia="ko-KR"/>
+        </w:rPr>
+        <w:tab/>
+      </w:r>
+      <w:r>
+        <w:rPr>
+          <w:rFonts w:ascii="Calibri" w:hAnsi="Calibri" w:cs="Calibri"/>
+          <w:b/>
+          <w:sz w:val="20"/>
+          <w:szCs w:val="20"/>
+          <w:lang w:eastAsia="ko-KR"/>
+        </w:rPr>
+        <w:tab/>
+      </w:r>
+      <w:r>
+        <w:rPr>
+          <w:rFonts w:ascii="Calibri" w:hAnsi="Calibri" w:cs="Calibri"/>
+          <w:b/>
+          <w:sz w:val="20"/>
+          <w:szCs w:val="20"/>
+          <w:lang w:eastAsia="ko-KR"/>
+        </w:rPr>
+        <w:tab/>
+      </w:r>
+      <w:r>
+        <w:rPr>
+          <w:rFonts w:ascii="Calibri" w:hAnsi="Calibri" w:cs="Calibri"/>
+          <w:b/>
+          <w:sz w:val="20"/>
+          <w:szCs w:val="20"/>
+          <w:lang w:eastAsia="ko-KR"/>
+        </w:rPr>
+        <w:tab/>
+      </w:r>
+      <w:r>
+        <w:rPr>
+          <w:rFonts w:ascii="Calibri" w:hAnsi="Calibri" w:cs="Calibri"/>
+          <w:b/>
+          <w:sz w:val="20"/>
+          <w:szCs w:val="20"/>
+          <w:lang w:eastAsia="ko-KR"/>
+        </w:rPr>
+        <w:tab/>
+      </w:r>
+      <w:r>
+        <w:rPr>
+          <w:rFonts w:ascii="Calibri" w:hAnsi="Calibri" w:cs="Calibri"/>
+          <w:b/>
+          <w:sz w:val="20"/>
+          <w:szCs w:val="20"/>
+          <w:lang w:eastAsia="ko-KR"/>
+        </w:rPr>
+        <w:tab/>
+        <w:t xml:space="preserve">              </w:t>
+      </w:r>
+      <w:r>
+        <w:rPr>
+          <w:rFonts w:ascii="Calibri Light" w:hAnsi="Calibri Light" w:cs="Calibri Light"/>
+          <w:sz w:val="16"/>
+          <w:szCs w:val="16"/>
+          <w:lang w:eastAsia="ko-KR"/>
+        </w:rPr>
+        <w:t>Seoul, Korea</w:t>
+      </w:r>
+    </w:p>
+    <w:p>
+      <w:pPr>
+        <w:tabs>
+          <w:tab w:val="right" w:pos="8640"/>
+        </w:tabs>
+        <w:rPr>
+          <w:rFonts w:ascii="Calibri Light" w:hAnsi="Calibri Light" w:cs="Calibri Light"/>
+          <w:i/>
+          <w:iCs/>
+          <w:sz w:val="16"/>
+          <w:szCs w:val="16"/>
+        </w:rPr>
+      </w:pPr>
+      <w:r>
+        <w:rPr>
+          <w:rFonts w:ascii="Calibri Light" w:hAnsi="Calibri Light" w:cs="Calibri Light"/>
+          <w:sz w:val="16"/>
+          <w:szCs w:val="16"/>
+          <w:lang w:eastAsia="ko-KR"/>
+        </w:rPr>
+        <w:t xml:space="preserve">Teaching Assistant </w:t>
+      </w:r>
+      <w:r>
+        <w:rPr>
+          <w:rFonts w:ascii="Calibri Light" w:hAnsi="Calibri Light" w:cs="Calibri Light"/>
+          <w:sz w:val="16"/>
+          <w:szCs w:val="16"/>
+          <w:lang w:eastAsia="ko-KR"/>
+        </w:rPr>
+        <w:tab/>
+      </w:r>
+      <w:r>
+        <w:rPr>
+          <w:rFonts w:ascii="Calibri Light" w:hAnsi="Calibri Light" w:cs="Calibri Light"/>
+          <w:sz w:val="16"/>
+          <w:szCs w:val="16"/>
+          <w:lang w:eastAsia="ko-KR"/>
+        </w:rPr>
+        <w:t xml:space="preserve"> </w:t>
+      </w:r>
+      <w:r>
+        <w:rPr>
+          <w:rFonts w:ascii="Calibri Light" w:hAnsi="Calibri Light" w:cs="Calibri Light"/>
+          <w:i/>
+          <w:iCs/>
+          <w:sz w:val="16"/>
+          <w:szCs w:val="16"/>
+          <w:lang w:eastAsia="ko-KR"/>
+        </w:rPr>
         <w:t xml:space="preserve">2020.03 ~ </w:t>
       </w:r>
       <w:r>
@@ -1331,7 +2198,7 @@
           <w:sz w:val="16"/>
           <w:szCs w:val="16"/>
         </w:rPr>
-        <w:t>present</w:t>
+        <w:t>2020.12</w:t>
       </w:r>
     </w:p>
     <w:p>
@@ -2897,6 +3764,8 @@
         </w:tabs>
         <w:rPr>
           <w:rFonts w:ascii="Calibri Light" w:hAnsi="Calibri Light" w:cs="Calibri Light"/>
+          <w:b/>
+          <w:bCs/>
           <w:sz w:val="20"/>
           <w:szCs w:val="20"/>
         </w:rPr>
@@ -3352,7 +4221,6 @@
           <w:sz w:val="22"/>
           <w:szCs w:val="28"/>
         </w:rPr>
-        <w:lastRenderedPageBreak/>
         <w:t>Skills</w:t>
       </w:r>
     </w:p>
@@ -3671,13 +4539,6 @@
       </w:r>
     </w:p>
     <w:p>
-      <w:pPr>
-        <w:rPr>
-          <w:rFonts w:ascii="Calibri Light" w:hAnsi="Calibri Light" w:cs="Calibri Light"/>
-          <w:sz w:val="16"/>
-          <w:szCs w:val="16"/>
-        </w:rPr>
-      </w:pPr>
       <w:r>
         <w:rPr>
           <w:rFonts w:ascii="Calibri Light" w:hAnsi="Calibri Light" w:cs="Calibri Light"/>
@@ -3711,10 +4572,117 @@
       <w:pPr>
         <w:rPr>
           <w:rFonts w:ascii="Calibri Light" w:hAnsi="Calibri Light" w:cs="Calibri Light"/>
-          <w:sz w:val="16"/>
-          <w:szCs w:val="16"/>
-        </w:rPr>
-      </w:pPr>
+          <w:i/>
+          <w:iCs/>
+          <w:sz w:val="16"/>
+          <w:szCs w:val="16"/>
+        </w:rPr>
+      </w:pPr>
+    </w:p>
+    <w:p>
+      <w:pPr>
+        <w:rPr>
+          <w:rFonts w:ascii="Calibri Light" w:hAnsi="Calibri Light" w:cs="Calibri Light"/>
+          <w:i/>
+          <w:iCs/>
+          <w:sz w:val="16"/>
+          <w:szCs w:val="16"/>
+        </w:rPr>
+      </w:pPr>
+    </w:p>
+    <w:p>
+      <w:pPr>
+        <w:jc w:val="right"/>
+        <w:rPr>
+          <w:rFonts w:ascii="Calibri Light" w:hAnsi="Calibri Light" w:cs="Calibri Light"/>
+          <w:sz w:val="16"/>
+          <w:szCs w:val="16"/>
+          <w:lang w:eastAsia="ko-KR"/>
+        </w:rPr>
+      </w:pPr>
+      <w:r>
+        <w:rPr>
+          <w:rFonts w:ascii="Calibri Light" w:hAnsi="Calibri Light" w:cs="Calibri Light"/>
+          <w:i/>
+          <w:iCs/>
+          <w:sz w:val="16"/>
+          <w:szCs w:val="16"/>
+        </w:rPr>
+        <w:t>- 2021.0</w:t>
+      </w:r>
+      <w:r>
+        <w:rPr>
+          <w:rFonts w:ascii="Calibri Light" w:hAnsi="Calibri Light" w:cs="Calibri Light"/>
+          <w:i/>
+          <w:iCs/>
+          <w:sz w:val="16"/>
+          <w:szCs w:val="16"/>
+        </w:rPr>
+        <w:t>7</w:t>
+      </w:r>
+      <w:r>
+        <w:rPr>
+          <w:rFonts w:ascii="Calibri Light" w:hAnsi="Calibri Light" w:cs="Calibri Light"/>
+          <w:i/>
+          <w:iCs/>
+          <w:sz w:val="16"/>
+          <w:szCs w:val="16"/>
+        </w:rPr>
+        <w:t>.</w:t>
+      </w:r>
+      <w:r>
+        <w:rPr>
+          <w:rFonts w:ascii="Calibri Light" w:hAnsi="Calibri Light" w:cs="Calibri Light"/>
+          <w:i/>
+          <w:iCs/>
+          <w:sz w:val="16"/>
+          <w:szCs w:val="16"/>
+        </w:rPr>
+        <w:t>29</w:t>
+      </w:r>
+      <w:r>
+        <w:rPr>
+          <w:rFonts w:ascii="Calibri Light" w:hAnsi="Calibri Light" w:cs="Calibri Light"/>
+          <w:i/>
+          <w:iCs/>
+          <w:sz w:val="16"/>
+          <w:szCs w:val="16"/>
+        </w:rPr>
+        <w:t xml:space="preserve"> </w:t>
+      </w:r>
+      <w:r>
+        <w:rPr>
+          <w:rFonts w:ascii="Calibri Light" w:hAnsi="Calibri Light" w:cs="Calibri Light" w:hint="eastAsia"/>
+          <w:i/>
+          <w:iCs/>
+          <w:sz w:val="16"/>
+          <w:szCs w:val="16"/>
+          <w:lang w:eastAsia="ko-KR"/>
+        </w:rPr>
+        <w:t>u</w:t>
+      </w:r>
+      <w:r>
+        <w:rPr>
+          <w:rFonts w:ascii="Calibri Light" w:hAnsi="Calibri Light" w:cs="Calibri Light"/>
+          <w:i/>
+          <w:iCs/>
+          <w:sz w:val="16"/>
+          <w:szCs w:val="16"/>
+          <w:lang w:eastAsia="ko-KR"/>
+        </w:rPr>
+        <w:t>pdated</w:t>
+      </w:r>
+      <w:r>
+        <w:rPr>
+          <w:rFonts w:ascii="Calibri Light" w:hAnsi="Calibri Light" w:cs="Calibri Light"/>
+          <w:i/>
+          <w:iCs/>
+          <w:sz w:val="16"/>
+          <w:szCs w:val="16"/>
+          <w:lang w:eastAsia="ko-KR"/>
+        </w:rPr>
+        <w:t xml:space="preserve"> -</w:t>
+      </w:r>
     </w:p>
     <w:sectPr>
       <w:footerReference w:type="default" r:id="rId12"/>
@@ -3728,7 +4696,7 @@
 </file>
 
 <file path=word/endnotes.xml><?xml version="1.0" encoding="utf-8"?>
-<w:endnotes xmlns:wpc="http://schemas.microsoft.com/office/word/2010/wordprocessingCanvas" xmlns:cx="http://schemas.microsoft.com/office/drawing/2014/chartex" xmlns:cx1="http://schemas.microsoft.com/office/drawing/2015/9/8/chartex" xmlns:cx2="http://schemas.microsoft.com/office/drawing/2015/10/21/chartex" xmlns:cx3="http://schemas.microsoft.com/office/drawing/2016/5/9/chartex" xmlns:cx4="http://schemas.microsoft.com/office/drawing/2016/5/10/chartex" xmlns:cx5="http://schemas.microsoft.com/office/drawing/2016/5/11/chartex" xmlns:cx6="http://schemas.microsoft.com/office/drawing/2016/5/12/chartex" xmlns:cx7="http://schemas.microsoft.com/office/drawing/2016/5/13/chartex" xmlns:cx8="http://schemas.microsoft.com/office/drawing/2016/5/14/chartex" xmlns:mc="http://schemas.openxmlformats.org/markup-compatibility/2006" xmlns:aink="http://schemas.microsoft.com/office/drawing/2016/ink" xmlns:am3d="http://schemas.microsoft.com/office/drawing/2017/model3d" xmlns:o="urn:schemas-microsoft-com:office:office" xmlns:r="http://schemas.openxmlformats.org/officeDocument/2006/relationships" xmlns:m="http://schemas.openxmlformats.org/officeDocument/2006/math" xmlns:v="urn:schemas-microsoft-com:vml" xmlns:wp14="http://schemas.microsoft.com/office/word/2010/wordprocessingDrawing" xmlns:wp="http://schemas.openxmlformats.org/drawingml/2006/wordprocessingDrawing" xmlns:w10="urn:schemas-microsoft-com:office:word" xmlns:w="http://schemas.openxmlformats.org/wordprocessingml/2006/main" xmlns:w14="http://schemas.microsoft.com/office/word/2010/wordml" xmlns:w15="http://schemas.microsoft.com/office/word/2012/wordml" xmlns:w16cex="http://schemas.microsoft.com/office/word/2018/wordml/cex" xmlns:w16cid="http://schemas.microsoft.com/office/word/2016/wordml/cid" xmlns:w16="http://schemas.microsoft.com/office/word/2018/wordml" xmlns:w16se="http://schemas.microsoft.com/office/word/2015/wordml/symex" xmlns:wpg="http://schemas.microsoft.com/office/word/2010/wordprocessingGroup" xmlns:wpi="http://schemas.microsoft.com/office/word/2010/wordprocessingInk" xmlns:wne="http://schemas.microsoft.com/office/word/2006/wordml" xmlns:wps="http://schemas.microsoft.com/office/word/2010/wordprocessingShape" mc:Ignorable="w14 w15 w16se w16cid w16 w16cex wp14">
+<w:endnotes xmlns:wpc="http://schemas.microsoft.com/office/word/2010/wordprocessingCanvas" xmlns:cx="http://schemas.microsoft.com/office/drawing/2014/chartex" xmlns:cx1="http://schemas.microsoft.com/office/drawing/2015/9/8/chartex" xmlns:cx2="http://schemas.microsoft.com/office/drawing/2015/10/21/chartex" xmlns:cx3="http://schemas.microsoft.com/office/drawing/2016/5/9/chartex" xmlns:cx4="http://schemas.microsoft.com/office/drawing/2016/5/10/chartex" xmlns:cx5="http://schemas.microsoft.com/office/drawing/2016/5/11/chartex" xmlns:cx6="http://schemas.microsoft.com/office/drawing/2016/5/12/chartex" xmlns:cx7="http://schemas.microsoft.com/office/drawing/2016/5/13/chartex" xmlns:cx8="http://schemas.microsoft.com/office/drawing/2016/5/14/chartex" xmlns:mc="http://schemas.openxmlformats.org/markup-compatibility/2006" xmlns:aink="http://schemas.microsoft.com/office/drawing/2016/ink" xmlns:am3d="http://schemas.microsoft.com/office/drawing/2017/model3d" xmlns:o="urn:schemas-microsoft-com:office:office" xmlns:r="http://schemas.openxmlformats.org/officeDocument/2006/relationships" xmlns:m="http://schemas.openxmlformats.org/officeDocument/2006/math" xmlns:v="urn:schemas-microsoft-com:vml" xmlns:wp14="http://schemas.microsoft.com/office/word/2010/wordprocessingDrawing" xmlns:wp="http://schemas.openxmlformats.org/drawingml/2006/wordprocessingDrawing" xmlns:w10="urn:schemas-microsoft-com:office:word" xmlns:w="http://schemas.openxmlformats.org/wordprocessingml/2006/main" xmlns:w14="http://schemas.microsoft.com/office/word/2010/wordml" xmlns:w15="http://schemas.microsoft.com/office/word/2012/wordml" xmlns:w16cex="http://schemas.microsoft.com/office/word/2018/wordml/cex" xmlns:w16cid="http://schemas.microsoft.com/office/word/2016/wordml/cid" xmlns:w16="http://schemas.microsoft.com/office/word/2018/wordml" xmlns:w16sdtdh="http://schemas.microsoft.com/office/word/2020/wordml/sdtdatahash" xmlns:w16se="http://schemas.microsoft.com/office/word/2015/wordml/symex" xmlns:wpg="http://schemas.microsoft.com/office/word/2010/wordprocessingGroup" xmlns:wpi="http://schemas.microsoft.com/office/word/2010/wordprocessingInk" xmlns:wne="http://schemas.microsoft.com/office/word/2006/wordml" xmlns:wps="http://schemas.microsoft.com/office/word/2010/wordprocessingShape" mc:Ignorable="w14 w15 w16se w16cid w16 w16cex w16sdtdh wp14">
   <w:endnote w:type="separator" w:id="-1">
     <w:p>
       <w:r>
@@ -3747,7 +4715,7 @@
 </file>
 
 <file path=word/footer1.xml><?xml version="1.0" encoding="utf-8"?>
-<w:ftr xmlns:wpc="http://schemas.microsoft.com/office/word/2010/wordprocessingCanvas" xmlns:cx="http://schemas.microsoft.com/office/drawing/2014/chartex" xmlns:cx1="http://schemas.microsoft.com/office/drawing/2015/9/8/chartex" xmlns:cx2="http://schemas.microsoft.com/office/drawing/2015/10/21/chartex" xmlns:cx3="http://schemas.microsoft.com/office/drawing/2016/5/9/chartex" xmlns:cx4="http://schemas.microsoft.com/office/drawing/2016/5/10/chartex" xmlns:cx5="http://schemas.microsoft.com/office/drawing/2016/5/11/chartex" xmlns:cx6="http://schemas.microsoft.com/office/drawing/2016/5/12/chartex" xmlns:cx7="http://schemas.microsoft.com/office/drawing/2016/5/13/chartex" xmlns:cx8="http://schemas.microsoft.com/office/drawing/2016/5/14/chartex" xmlns:mc="http://schemas.openxmlformats.org/markup-compatibility/2006" xmlns:aink="http://schemas.microsoft.com/office/drawing/2016/ink" xmlns:am3d="http://schemas.microsoft.com/office/drawing/2017/model3d" xmlns:o="urn:schemas-microsoft-com:office:office" xmlns:r="http://schemas.openxmlformats.org/officeDocument/2006/relationships" xmlns:m="http://schemas.openxmlformats.org/officeDocument/2006/math" xmlns:v="urn:schemas-microsoft-com:vml" xmlns:wp14="http://schemas.microsoft.com/office/word/2010/wordprocessingDrawing" xmlns:wp="http://schemas.openxmlformats.org/drawingml/2006/wordprocessingDrawing" xmlns:w10="urn:schemas-microsoft-com:office:word" xmlns:w="http://schemas.openxmlformats.org/wordprocessingml/2006/main" xmlns:w14="http://schemas.microsoft.com/office/word/2010/wordml" xmlns:w15="http://schemas.microsoft.com/office/word/2012/wordml" xmlns:w16cex="http://schemas.microsoft.com/office/word/2018/wordml/cex" xmlns:w16cid="http://schemas.microsoft.com/office/word/2016/wordml/cid" xmlns:w16="http://schemas.microsoft.com/office/word/2018/wordml" xmlns:w16se="http://schemas.microsoft.com/office/word/2015/wordml/symex" xmlns:wpg="http://schemas.microsoft.com/office/word/2010/wordprocessingGroup" xmlns:wpi="http://schemas.microsoft.com/office/word/2010/wordprocessingInk" xmlns:wne="http://schemas.microsoft.com/office/word/2006/wordml" xmlns:wps="http://schemas.microsoft.com/office/word/2010/wordprocessingShape" mc:Ignorable="w14 w15 w16se w16cid w16 w16cex wp14">
+<w:ftr xmlns:wpc="http://schemas.microsoft.com/office/word/2010/wordprocessingCanvas" xmlns:cx="http://schemas.microsoft.com/office/drawing/2014/chartex" xmlns:cx1="http://schemas.microsoft.com/office/drawing/2015/9/8/chartex" xmlns:cx2="http://schemas.microsoft.com/office/drawing/2015/10/21/chartex" xmlns:cx3="http://schemas.microsoft.com/office/drawing/2016/5/9/chartex" xmlns:cx4="http://schemas.microsoft.com/office/drawing/2016/5/10/chartex" xmlns:cx5="http://schemas.microsoft.com/office/drawing/2016/5/11/chartex" xmlns:cx6="http://schemas.microsoft.com/office/drawing/2016/5/12/chartex" xmlns:cx7="http://schemas.microsoft.com/office/drawing/2016/5/13/chartex" xmlns:cx8="http://schemas.microsoft.com/office/drawing/2016/5/14/chartex" xmlns:mc="http://schemas.openxmlformats.org/markup-compatibility/2006" xmlns:aink="http://schemas.microsoft.com/office/drawing/2016/ink" xmlns:am3d="http://schemas.microsoft.com/office/drawing/2017/model3d" xmlns:o="urn:schemas-microsoft-com:office:office" xmlns:r="http://schemas.openxmlformats.org/officeDocument/2006/relationships" xmlns:m="http://schemas.openxmlformats.org/officeDocument/2006/math" xmlns:v="urn:schemas-microsoft-com:vml" xmlns:wp14="http://schemas.microsoft.com/office/word/2010/wordprocessingDrawing" xmlns:wp="http://schemas.openxmlformats.org/drawingml/2006/wordprocessingDrawing" xmlns:w10="urn:schemas-microsoft-com:office:word" xmlns:w="http://schemas.openxmlformats.org/wordprocessingml/2006/main" xmlns:w14="http://schemas.microsoft.com/office/word/2010/wordml" xmlns:w15="http://schemas.microsoft.com/office/word/2012/wordml" xmlns:w16cex="http://schemas.microsoft.com/office/word/2018/wordml/cex" xmlns:w16cid="http://schemas.microsoft.com/office/word/2016/wordml/cid" xmlns:w16="http://schemas.microsoft.com/office/word/2018/wordml" xmlns:w16sdtdh="http://schemas.microsoft.com/office/word/2020/wordml/sdtdatahash" xmlns:w16se="http://schemas.microsoft.com/office/word/2015/wordml/symex" xmlns:wpg="http://schemas.microsoft.com/office/word/2010/wordprocessingGroup" xmlns:wpi="http://schemas.microsoft.com/office/word/2010/wordprocessingInk" xmlns:wne="http://schemas.microsoft.com/office/word/2006/wordml" xmlns:wps="http://schemas.microsoft.com/office/word/2010/wordprocessingShape" mc:Ignorable="w14 w15 w16se w16cid w16 w16cex w16sdtdh wp14">
   <w:p>
     <w:pPr>
       <w:pStyle w:val="Footer"/>
@@ -3798,7 +4766,7 @@
 </file>
 
 <file path=word/footnotes.xml><?xml version="1.0" encoding="utf-8"?>
-<w:footnotes xmlns:wpc="http://schemas.microsoft.com/office/word/2010/wordprocessingCanvas" xmlns:cx="http://schemas.microsoft.com/office/drawing/2014/chartex" xmlns:cx1="http://schemas.microsoft.com/office/drawing/2015/9/8/chartex" xmlns:cx2="http://schemas.microsoft.com/office/drawing/2015/10/21/chartex" xmlns:cx3="http://schemas.microsoft.com/office/drawing/2016/5/9/chartex" xmlns:cx4="http://schemas.microsoft.com/office/drawing/2016/5/10/chartex" xmlns:cx5="http://schemas.microsoft.com/office/drawing/2016/5/11/chartex" xmlns:cx6="http://schemas.microsoft.com/office/drawing/2016/5/12/chartex" xmlns:cx7="http://schemas.microsoft.com/office/drawing/2016/5/13/chartex" xmlns:cx8="http://schemas.microsoft.com/office/drawing/2016/5/14/chartex" xmlns:mc="http://schemas.openxmlformats.org/markup-compatibility/2006" xmlns:aink="http://schemas.microsoft.com/office/drawing/2016/ink" xmlns:am3d="http://schemas.microsoft.com/office/drawing/2017/model3d" xmlns:o="urn:schemas-microsoft-com:office:office" xmlns:r="http://schemas.openxmlformats.org/officeDocument/2006/relationships" xmlns:m="http://schemas.openxmlformats.org/officeDocument/2006/math" xmlns:v="urn:schemas-microsoft-com:vml" xmlns:wp14="http://schemas.microsoft.com/office/word/2010/wordprocessingDrawing" xmlns:wp="http://schemas.openxmlformats.org/drawingml/2006/wordprocessingDrawing" xmlns:w10="urn:schemas-microsoft-com:office:word" xmlns:w="http://schemas.openxmlformats.org/wordprocessingml/2006/main" xmlns:w14="http://schemas.microsoft.com/office/word/2010/wordml" xmlns:w15="http://schemas.microsoft.com/office/word/2012/wordml" xmlns:w16cex="http://schemas.microsoft.com/office/word/2018/wordml/cex" xmlns:w16cid="http://schemas.microsoft.com/office/word/2016/wordml/cid" xmlns:w16="http://schemas.microsoft.com/office/word/2018/wordml" xmlns:w16se="http://schemas.microsoft.com/office/word/2015/wordml/symex" xmlns:wpg="http://schemas.microsoft.com/office/word/2010/wordprocessingGroup" xmlns:wpi="http://schemas.microsoft.com/office/word/2010/wordprocessingInk" xmlns:wne="http://schemas.microsoft.com/office/word/2006/wordml" xmlns:wps="http://schemas.microsoft.com/office/word/2010/wordprocessingShape" mc:Ignorable="w14 w15 w16se w16cid w16 w16cex wp14">
+<w:footnotes xmlns:wpc="http://schemas.microsoft.com/office/word/2010/wordprocessingCanvas" xmlns:cx="http://schemas.microsoft.com/office/drawing/2014/chartex" xmlns:cx1="http://schemas.microsoft.com/office/drawing/2015/9/8/chartex" xmlns:cx2="http://schemas.microsoft.com/office/drawing/2015/10/21/chartex" xmlns:cx3="http://schemas.microsoft.com/office/drawing/2016/5/9/chartex" xmlns:cx4="http://schemas.microsoft.com/office/drawing/2016/5/10/chartex" xmlns:cx5="http://schemas.microsoft.com/office/drawing/2016/5/11/chartex" xmlns:cx6="http://schemas.microsoft.com/office/drawing/2016/5/12/chartex" xmlns:cx7="http://schemas.microsoft.com/office/drawing/2016/5/13/chartex" xmlns:cx8="http://schemas.microsoft.com/office/drawing/2016/5/14/chartex" xmlns:mc="http://schemas.openxmlformats.org/markup-compatibility/2006" xmlns:aink="http://schemas.microsoft.com/office/drawing/2016/ink" xmlns:am3d="http://schemas.microsoft.com/office/drawing/2017/model3d" xmlns:o="urn:schemas-microsoft-com:office:office" xmlns:r="http://schemas.openxmlformats.org/officeDocument/2006/relationships" xmlns:m="http://schemas.openxmlformats.org/officeDocument/2006/math" xmlns:v="urn:schemas-microsoft-com:vml" xmlns:wp14="http://schemas.microsoft.com/office/word/2010/wordprocessingDrawing" xmlns:wp="http://schemas.openxmlformats.org/drawingml/2006/wordprocessingDrawing" xmlns:w10="urn:schemas-microsoft-com:office:word" xmlns:w="http://schemas.openxmlformats.org/wordprocessingml/2006/main" xmlns:w14="http://schemas.microsoft.com/office/word/2010/wordml" xmlns:w15="http://schemas.microsoft.com/office/word/2012/wordml" xmlns:w16cex="http://schemas.microsoft.com/office/word/2018/wordml/cex" xmlns:w16cid="http://schemas.microsoft.com/office/word/2016/wordml/cid" xmlns:w16="http://schemas.microsoft.com/office/word/2018/wordml" xmlns:w16sdtdh="http://schemas.microsoft.com/office/word/2020/wordml/sdtdatahash" xmlns:w16se="http://schemas.microsoft.com/office/word/2015/wordml/symex" xmlns:wpg="http://schemas.microsoft.com/office/word/2010/wordprocessingGroup" xmlns:wpi="http://schemas.microsoft.com/office/word/2010/wordprocessingInk" xmlns:wne="http://schemas.microsoft.com/office/word/2006/wordml" xmlns:wps="http://schemas.microsoft.com/office/word/2010/wordprocessingShape" mc:Ignorable="w14 w15 w16se w16cid w16 w16cex w16sdtdh wp14">
   <w:footnote w:type="separator" w:id="-1">
     <w:p>
       <w:r>
@@ -3817,7 +4785,7 @@
 </file>
 
 <file path=word/numbering.xml><?xml version="1.0" encoding="utf-8"?>
-<w:numbering xmlns:wpc="http://schemas.microsoft.com/office/word/2010/wordprocessingCanvas" xmlns:cx="http://schemas.microsoft.com/office/drawing/2014/chartex" xmlns:cx1="http://schemas.microsoft.com/office/drawing/2015/9/8/chartex" xmlns:cx2="http://schemas.microsoft.com/office/drawing/2015/10/21/chartex" xmlns:cx3="http://schemas.microsoft.com/office/drawing/2016/5/9/chartex" xmlns:cx4="http://schemas.microsoft.com/office/drawing/2016/5/10/chartex" xmlns:cx5="http://schemas.microsoft.com/office/drawing/2016/5/11/chartex" xmlns:cx6="http://schemas.microsoft.com/office/drawing/2016/5/12/chartex" xmlns:cx7="http://schemas.microsoft.com/office/drawing/2016/5/13/chartex" xmlns:cx8="http://schemas.microsoft.com/office/drawing/2016/5/14/chartex" xmlns:mc="http://schemas.openxmlformats.org/markup-compatibility/2006" xmlns:aink="http://schemas.microsoft.com/office/drawing/2016/ink" xmlns:am3d="http://schemas.microsoft.com/office/drawing/2017/model3d" xmlns:o="urn:schemas-microsoft-com:office:office" xmlns:r="http://schemas.openxmlformats.org/officeDocument/2006/relationships" xmlns:m="http://schemas.openxmlformats.org/officeDocument/2006/math" xmlns:v="urn:schemas-microsoft-com:vml" xmlns:wp14="http://schemas.microsoft.com/office/word/2010/wordprocessingDrawing" xmlns:wp="http://schemas.openxmlformats.org/drawingml/2006/wordprocessingDrawing" xmlns:w10="urn:schemas-microsoft-com:office:word" xmlns:w="http://schemas.openxmlformats.org/wordprocessingml/2006/main" xmlns:w14="http://schemas.microsoft.com/office/word/2010/wordml" xmlns:w15="http://schemas.microsoft.com/office/word/2012/wordml" xmlns:w16cex="http://schemas.microsoft.com/office/word/2018/wordml/cex" xmlns:w16cid="http://schemas.microsoft.com/office/word/2016/wordml/cid" xmlns:w16="http://schemas.microsoft.com/office/word/2018/wordml" xmlns:w16se="http://schemas.microsoft.com/office/word/2015/wordml/symex" xmlns:wpg="http://schemas.microsoft.com/office/word/2010/wordprocessingGroup" xmlns:wpi="http://schemas.microsoft.com/office/word/2010/wordprocessingInk" xmlns:wne="http://schemas.microsoft.com/office/word/2006/wordml" xmlns:wps="http://schemas.microsoft.com/office/word/2010/wordprocessingShape" mc:Ignorable="w14 w15 w16se w16cid w16 w16cex wp14">
+<w:numbering xmlns:wpc="http://schemas.microsoft.com/office/word/2010/wordprocessingCanvas" xmlns:cx="http://schemas.microsoft.com/office/drawing/2014/chartex" xmlns:cx1="http://schemas.microsoft.com/office/drawing/2015/9/8/chartex" xmlns:cx2="http://schemas.microsoft.com/office/drawing/2015/10/21/chartex" xmlns:cx3="http://schemas.microsoft.com/office/drawing/2016/5/9/chartex" xmlns:cx4="http://schemas.microsoft.com/office/drawing/2016/5/10/chartex" xmlns:cx5="http://schemas.microsoft.com/office/drawing/2016/5/11/chartex" xmlns:cx6="http://schemas.microsoft.com/office/drawing/2016/5/12/chartex" xmlns:cx7="http://schemas.microsoft.com/office/drawing/2016/5/13/chartex" xmlns:cx8="http://schemas.microsoft.com/office/drawing/2016/5/14/chartex" xmlns:mc="http://schemas.openxmlformats.org/markup-compatibility/2006" xmlns:aink="http://schemas.microsoft.com/office/drawing/2016/ink" xmlns:am3d="http://schemas.microsoft.com/office/drawing/2017/model3d" xmlns:o="urn:schemas-microsoft-com:office:office" xmlns:r="http://schemas.openxmlformats.org/officeDocument/2006/relationships" xmlns:m="http://schemas.openxmlformats.org/officeDocument/2006/math" xmlns:v="urn:schemas-microsoft-com:vml" xmlns:wp14="http://schemas.microsoft.com/office/word/2010/wordprocessingDrawing" xmlns:wp="http://schemas.openxmlformats.org/drawingml/2006/wordprocessingDrawing" xmlns:w10="urn:schemas-microsoft-com:office:word" xmlns:w="http://schemas.openxmlformats.org/wordprocessingml/2006/main" xmlns:w14="http://schemas.microsoft.com/office/word/2010/wordml" xmlns:w15="http://schemas.microsoft.com/office/word/2012/wordml" xmlns:w16cex="http://schemas.microsoft.com/office/word/2018/wordml/cex" xmlns:w16cid="http://schemas.microsoft.com/office/word/2016/wordml/cid" xmlns:w16="http://schemas.microsoft.com/office/word/2018/wordml" xmlns:w16sdtdh="http://schemas.microsoft.com/office/word/2020/wordml/sdtdatahash" xmlns:w16se="http://schemas.microsoft.com/office/word/2015/wordml/symex" xmlns:wpg="http://schemas.microsoft.com/office/word/2010/wordprocessingGroup" xmlns:wpi="http://schemas.microsoft.com/office/word/2010/wordprocessingInk" xmlns:wne="http://schemas.microsoft.com/office/word/2006/wordml" xmlns:wps="http://schemas.microsoft.com/office/word/2010/wordprocessingShape" mc:Ignorable="w14 w15 w16se w16cid w16 w16cex w16sdtdh wp14">
   <w:abstractNum w:abstractNumId="0" w15:restartNumberingAfterBreak="0">
     <w:nsid w:val="040858FE"/>
     <w:multiLevelType w:val="hybridMultilevel"/>
@@ -5054,7 +6022,7 @@
 </file>
 
 <file path=word/styles.xml><?xml version="1.0" encoding="utf-8"?>
-<w:styles xmlns:mc="http://schemas.openxmlformats.org/markup-compatibility/2006" xmlns:r="http://schemas.openxmlformats.org/officeDocument/2006/relationships" xmlns:w="http://schemas.openxmlformats.org/wordprocessingml/2006/main" xmlns:w14="http://schemas.microsoft.com/office/word/2010/wordml" xmlns:w15="http://schemas.microsoft.com/office/word/2012/wordml" xmlns:w16cex="http://schemas.microsoft.com/office/word/2018/wordml/cex" xmlns:w16cid="http://schemas.microsoft.com/office/word/2016/wordml/cid" xmlns:w16="http://schemas.microsoft.com/office/word/2018/wordml" xmlns:w16se="http://schemas.microsoft.com/office/word/2015/wordml/symex" mc:Ignorable="w14 w15 w16se w16cid w16 w16cex">
+<w:styles xmlns:mc="http://schemas.openxmlformats.org/markup-compatibility/2006" xmlns:r="http://schemas.openxmlformats.org/officeDocument/2006/relationships" xmlns:w="http://schemas.openxmlformats.org/wordprocessingml/2006/main" xmlns:w14="http://schemas.microsoft.com/office/word/2010/wordml" xmlns:w15="http://schemas.microsoft.com/office/word/2012/wordml" xmlns:w16cex="http://schemas.microsoft.com/office/word/2018/wordml/cex" xmlns:w16cid="http://schemas.microsoft.com/office/word/2016/wordml/cid" xmlns:w16="http://schemas.microsoft.com/office/word/2018/wordml" xmlns:w16sdtdh="http://schemas.microsoft.com/office/word/2020/wordml/sdtdatahash" xmlns:w16se="http://schemas.microsoft.com/office/word/2015/wordml/symex" mc:Ignorable="w14 w15 w16se w16cid w16 w16cex w16sdtdh">
   <w:docDefaults>
     <w:rPrDefault>
       <w:rPr>

</xml_diff>